<commit_message>
Results: measured small-context Maverick runs (S=10 and S=100)
Two prover runs of the full 48-layer model at the demonstrated
configuration (40 columns, all tokens hidden, greedy transcripts
continuing prefixes of the same 1000-token document, generated by the
same llama.cpp backend):

  S=10  (5+5):    19592 s = 5.44 h, peak GPU 44.5 GB, U-hat 0.514 bits/tok
  S=100 (50+50):  21020 s = 5.84 h, peak GPU 47.3 GB, U-hat 0.427 bits/tok

Reported in section 9 as the measured weights floor: nearly flat below
the first crossover, pair-ratio 1.07 vs the cost model's witness ratio
1.10, about 2x the identity floor at tiny context (fixed per-round
overheads). Text states explicitly that these are prover-side runtime
measurements whose proofs were not run through the verifier.

Co-Authored-By: Claude Opus 4.8 <noreply@anthropic.com>
</commit_message>
<xml_diff>
--- a/paper.docx
+++ b/paper.docx
@@ -8617,6 +8617,82 @@
       </w:r>
       <w:r>
         <w:t xml:space="preserve">bits per token, continuation tokens public) predated two prover soundness fixes (a vacuous RMSNorm bracket and a constraint-fold defect) and is superseded by this run; its lower bound reflects a transcript generated by a different backend with higher integer-model agreement, a predictor-side difference that §4 prices, not a change in the proof system. Raising the configuration to 80 opened columns is a deployment choice whose measured cost is verification runtime, since the per-column work grows with the count (a GPU verifier is the identified path, §10); verifier memory is dominated by parsing the opened columns and does not depend on how many are checked.</w:t>
+      </w:r>
+    </w:p>
+    <w:p>
+      <w:pPr>
+        <w:pStyle w:val="BodyText"/>
+      </w:pPr>
+      <w:r>
+        <w:rPr>
+          <w:bCs/>
+          <w:b/>
+        </w:rPr>
+        <w:t xml:space="preserve">Llama-4-Maverick, small context.</w:t>
+      </w:r>
+      <w:r>
+        <w:t xml:space="preserve"> </w:t>
+      </w:r>
+      <w:r>
+        <w:t xml:space="preserve">Two further runs of the full model at the demonstrated configuration measure the prover’s weights floor directly: 10 tokens (a 5-token prompt and 5-token greedy continuation) prove in 5.4 hours, and 100 tokens (50 and 50) in 5.9 hours, against 14.3 hours at 1000 tokens. Proving time is nearly flat below the first crossover of §8, where the witness is almost entirely the committed weights; the measured pair scales with the modeled witness (a ratio of 1.07 against the model’s 1.10) but sits about twice the cost identity’s floor, since the per-round fold and re-encode overheads do not shrink with</w:t>
+      </w:r>
+      <w:r>
+        <w:t xml:space="preserve"> </w:t>
+      </w:r>
+      <m:oMath>
+        <m:r>
+          <m:t>S</m:t>
+        </m:r>
+      </m:oMath>
+      <w:r>
+        <w:t xml:space="preserve"> </w:t>
+      </w:r>
+      <w:r>
+        <w:t xml:space="preserve">(§8). This flat floor is what the persistent weight commitment of §6.4 removes. The runs report</w:t>
+      </w:r>
+      <w:r>
+        <w:t xml:space="preserve"> </w:t>
+      </w:r>
+      <m:oMath>
+        <m:acc>
+          <m:accPr>
+            <m:chr m:val="̂"/>
+          </m:accPr>
+          <m:e>
+            <m:r>
+              <m:t>U</m:t>
+            </m:r>
+          </m:e>
+        </m:acc>
+        <m:r>
+          <m:rPr>
+            <m:sty m:val="p"/>
+          </m:rPr>
+          <m:t>=</m:t>
+        </m:r>
+        <m:r>
+          <m:t>0.514</m:t>
+        </m:r>
+      </m:oMath>
+      <w:r>
+        <w:t xml:space="preserve"> </w:t>
+      </w:r>
+      <w:r>
+        <w:t xml:space="preserve">and</w:t>
+      </w:r>
+      <w:r>
+        <w:t xml:space="preserve"> </w:t>
+      </w:r>
+      <m:oMath>
+        <m:r>
+          <m:t>0.427</m:t>
+        </m:r>
+      </m:oMath>
+      <w:r>
+        <w:t xml:space="preserve"> </w:t>
+      </w:r>
+      <w:r>
+        <w:t xml:space="preserve">bits per token over their 5 and 50 scored positions; these are prover-side runtime measurements, and their proofs were not run through the verifier.</w:t>
       </w:r>
     </w:p>
     <w:p>

</xml_diff>